<commit_message>
State the denominators the milestone tables rest on
Aim 3 now names its sample: about 40 provider accounts per market reach a
priced offer, 320 across the eight markets and 80 per arm, sizing
account-level conversion to a ten-point half-width. Lifetime value and
acquisition cost are pooled across markets, and per-market contribution
margin is flagged as descriptive below 20 paying accounts so a thin cell is
never presented as a result.

Aim 1's expert panel audits 60 cases a quarter, 240 over the award, with the
precision that buys stated.

Separate the two retention thresholds that were in conflict. The month 21
gate reads the free-market placements and is anchored to the provider's own
arithmetic rather than to our other bar; the month 30 stop rule reads the
wave-one paid markets, and the document now says so.

Name the four million dollar request once, where market entry is already
computed against it.
</commit_message>
<xml_diff>
--- a/docs/crp/passes/Olera_CRP_ResearchStrategy.docx
+++ b/docs/crp/passes/Olera_CRP_ResearchStrategy.docx
@@ -3107,7 +3107,7 @@
           <w:b w:val="0"/>
           <w:i w:val="0"/>
         </w:rPr>
-        <w:t xml:space="preserve"> The count follows from what each aim has to measure. Two free markets, because one cannot separate a product that works from a market that happens to work, and the two differ on workforce source so the campus dependency is tested while it is still free to learn. Then eight paid markets: four price points, because two would show the direction of demand and four show the shape of the curve; two markets per point, because price is assigned by market and one market per arm means the arm is a market; and within each pair one market has a health-professions campus nearby and one does not, so price is crossed with workforce source rather than confounded with it. They open in two waves of four, the first early enough to observe 12-month retention and the second run as written by staff who did not design it. At roughly $30,000 to enter a market, ten markets is about seven percent of the requested budget; the binding constraint is operating attention, not capital.</w:t>
+        <w:t xml:space="preserve"> The count follows from what each aim has to measure. Two free markets, because one cannot separate a product that works from a market that happens to work, and the two differ on workforce source so the campus dependency is tested while it is still free to learn. Then eight paid markets: four price points, because two would show the direction of demand and four show the shape of the curve; two markets per point, because price is assigned by market and one market per arm means the arm is a market; and within each pair one market has a health-professions campus nearby and one does not, so price is crossed with workforce source rather than confounded with it. They open in two waves of four, the first early enough to observe 12-month retention and the second run as written by staff who did not design it. At roughly $30,000 to enter a market, ten markets is about $300,000, or under eight percent of the $4 million requested; the binding constraint is operating attention, not capital.</w:t>
       </w:r>
     </w:p>
     <w:p>
@@ -3233,7 +3233,7 @@
           <w:b w:val="0"/>
           <w:i w:val="0"/>
         </w:rPr>
-        <w:t xml:space="preserve"> A panel of licensed clinical social workers, independent of the engineering team and holding no equity in Olera, audits a stratified random sample of cases each quarter. The panel determines eligibility blinded to what the platform produced and, for a subset, prepares the applications by hand. Both are compared with the platform's output, category by category for eligibility and field by field for applications, and agreement is reported as percent agreement with a 95 percent confidence interval and as Cohen's kappa. Inter-rater reliability among panelists is established before any system output is adjudicated, so panel disagreement is not mistaken for system error. Every material error is reviewed rather than sampled and confirmed by a second reader, and audited households are held out of tuning data. This is internal product verification, not human subjects research, and a determination will be obtained.</w:t>
+        <w:t xml:space="preserve"> A panel of licensed clinical social workers, independent of the engineering team and holding no equity in Olera, audits a stratified random sample of 60 cases each quarter, 240 over the award, which sizes quarterly agreement to a 95 percent half-width of about 9 points and the cumulative figure to about 5. The panel determines eligibility blinded to what the platform produced and, for a subset, prepares the applications by hand. Both are compared with the platform's output, category by category for eligibility and field by field for applications, and agreement is reported as percent agreement with a 95 percent confidence interval and as Cohen's kappa. Inter-rater reliability among panelists is established before any system output is adjudicated, so panel disagreement is not mistaken for system error. Every material error is reviewed rather than sampled and confirmed by a second reader, and audited households are held out of tuning data. This is internal product verification, not human subjects research, and a determination will be obtained.</w:t>
       </w:r>
     </w:p>
     <w:p>
@@ -3450,7 +3450,7 @@
                 <w:i w:val="0"/>
                 <w:sz w:val="18"/>
               </w:rPr>
-              <w:t>Quarterly stratified audit, Task 1.4</w:t>
+              <w:t>Quarterly audit of 60 cases, Task 1.4</w:t>
             </w:r>
           </w:p>
         </w:tc>
@@ -4252,14 +4252,14 @@
           <w:b/>
           <w:i w:val="0"/>
         </w:rPr>
-        <w:t>The month 21 gate requires half of placed workers still in direct care at 90 days.</w:t>
+        <w:t>The month 21 gate requires half of the Aim 2 placements still in direct care at 90 days.</w:t>
       </w:r>
       <w:r>
         <w:rPr>
           <w:b w:val="0"/>
           <w:i w:val="0"/>
         </w:rPr>
-        <w:t xml:space="preserve"> That bar sits above the 40 percent floor at which the Aim 3 stop rule fires, so opening paid markets requires evidence that retention holds and not merely the absence of disconfirmation.</w:t>
+        <w:t xml:space="preserve"> Below that, a provider replaces half of what they bought within a quarter and pays twice for one hire, which is the point at which this stops being cheaper than what they do now.</w:t>
       </w:r>
     </w:p>
     <w:p>
@@ -5300,7 +5300,7 @@
           <w:b w:val="0"/>
           <w:i w:val="0"/>
         </w:rPr>
-        <w:t xml:space="preserve"> The primary comparison uses randomization inference: the observed difference between arms is referred to the distribution of differences the other possible price assignments would have produced. That is valid with few clusters and assumes nothing about large samples. Account-level generalized estimating equations, with market as the cluster and small-sample corrections, are pre-specified as secondary and reported as descriptive. A biostatistician sizes the arms against the conversion rate measured in Aim 2 rather than an assumed one, and states in advance the interval width the design will deliver, so no one discovers afterward that the answer was never going to be precise enough to act on. A pre-registered interim analysis at month 30 drops a dominated arm and reallocates to wave two. The decision rule selects the price maximizing expected 12-month revenue per account rather than conversion alone, because a price that converts and then churns is worse than one that does neither.</w:t>
+        <w:t xml:space="preserve"> The primary comparison uses randomization inference: the observed difference between arms is referred to the distribution of differences the other possible price assignments would have produced. That is valid with few clusters and assumes nothing about large samples. Account-level generalized estimating equations, with market as the cluster and small-sample corrections, are pre-specified as secondary and reported as descriptive. Approximately 40 provider accounts per market reach a priced offer, about 320 across the eight markets and 80 per arm, which sizes account-level conversion to a 95 percent half-width near 10 points in each arm. A biostatistician confirms that sizing against the conversion rate measured in Aim 2 rather than an assumed one, and states in advance the interval width the market-level comparison will deliver, so no one discovers afterward that the answer was never going to be precise enough to act on. A pre-registered interim analysis at month 30 drops a dominated arm and reallocates to wave two. The decision rule selects the price maximizing expected 12-month revenue per account rather than conversion alone, because a price that converts and then churns is worse than one that does neither.</w:t>
       </w:r>
     </w:p>
     <w:p>
@@ -5320,7 +5320,7 @@
           <w:b w:val="0"/>
           <w:i w:val="0"/>
         </w:rPr>
-        <w:t xml:space="preserve"> Every figure comes from live billing, payroll, and cost records. Acquisition cost includes spending on non-converters. Monthly net account margin is revenue less the cost to serve defined in Task 2.6. Retention is estimated at 3, 6, 9, and 12 months, and time to churn with discrete-time survival models on account-month records matching the billing cycle, treating voluntary cancellation, uncured payment failure, and downgrade as competing events. Restricted mean survival time at 12 months gives expected account lifetime, and lifetime times monthly net margin gives lifetime value with a confidence interval, so the payback and lifetime-to-acquisition-cost criteria carry measured uncertainty rather than point estimates. </w:t>
+        <w:t xml:space="preserve"> Every figure comes from live billing, payroll, and cost records. Acquisition cost includes spending on non-converters. Monthly net account margin is revenue less the cost to serve defined in Task 2.6. Lifetime value and acquisition cost are estimated on the converting accounts pooled across markets. Per-market contribution margin is reported for every market and flagged as descriptive where a market carries fewer than 20 paying accounts, so a thin cell is never presented as a result. Retention is estimated at 3, 6, 9, and 12 months, and time to churn with discrete-time survival models on account-month records matching the billing cycle, treating voluntary cancellation, uncured payment failure, and downgrade as competing events. Restricted mean survival time at 12 months gives expected account lifetime, and lifetime times monthly net margin gives lifetime value with a confidence interval, so the payback and lifetime-to-acquisition-cost criteria carry measured uncertainty rather than point estimates. </w:t>
       </w:r>
       <w:r>
         <w:rPr>
@@ -5562,7 +5562,7 @@
                 <w:i w:val="0"/>
                 <w:sz w:val="18"/>
               </w:rPr>
-              <w:t>Estimated with 95% CI</w:t>
+              <w:t>±10 pts per arm</w:t>
             </w:r>
           </w:p>
         </w:tc>
@@ -5585,7 +5585,7 @@
                 <w:i w:val="0"/>
                 <w:sz w:val="18"/>
               </w:rPr>
-              <w:t>Task 3.2, randomization inference across 8 markets</w:t>
+              <w:t>Task 3.2, ~320 offers, randomization inference</w:t>
             </w:r>
           </w:p>
         </w:tc>
@@ -6147,7 +6147,7 @@
           <w:b w:val="0"/>
           <w:i w:val="0"/>
         </w:rPr>
-        <w:t xml:space="preserve"> If, at the month 30 interim analysis, fewer than 40 percent of placed workers remain in direct care at 90 days </w:t>
+        <w:t xml:space="preserve"> If, at the month 30 interim analysis, fewer than 40 percent of the workers placed in the wave-one paid markets remain in direct care at 90 days </w:t>
       </w:r>
       <w:r>
         <w:rPr>
@@ -6161,7 +6161,7 @@
           <w:b w:val="0"/>
           <w:i w:val="0"/>
         </w:rPr>
-        <w:t xml:space="preserve"> paid conversion is below 20 percent at every offered price, we will report the provider-funded model as disconfirmed, hold wave two, and redirect the remaining effort to completing and publishing the analysis. A commercialization program should fund projects willing to find out they are wrong.</w:t>
+        <w:t xml:space="preserve"> paid conversion is below 20 percent at every offered price, we will report the provider-funded model as disconfirmed, hold wave two, and redirect the remaining effort to completing and publishing the analysis. The month 21 gate tested retention in the free markets; this tests whether it survives when a provider is paying for it. A commercialization program should fund projects willing to find out they are wrong.</w:t>
       </w:r>
     </w:p>
     <w:p>

</xml_diff>

<commit_message>
Match the audit sample to the timetable
The stated audit size implied four quarters of expert review; Figure 5 shows
Task 1.4 running the two quarters before the month 12 gate. The prose now
says 120 cases across those two quarters, with the precision that buys, and
notes the audit repeats annually thereafter.
</commit_message>
<xml_diff>
--- a/docs/crp/passes/Olera_CRP_ResearchStrategy.docx
+++ b/docs/crp/passes/Olera_CRP_ResearchStrategy.docx
@@ -3233,7 +3233,7 @@
           <w:b w:val="0"/>
           <w:i w:val="0"/>
         </w:rPr>
-        <w:t xml:space="preserve"> A panel of licensed clinical social workers, independent of the engineering team and holding no equity in Olera, audits a stratified random sample of 60 cases each quarter, 240 over the award, which sizes quarterly agreement to a 95 percent half-width of about 9 points and the cumulative figure to about 5. The panel determines eligibility blinded to what the platform produced and, for a subset, prepares the applications by hand. Both are compared with the platform's output, category by category for eligibility and field by field for applications, and agreement is reported as percent agreement with a 95 percent confidence interval and as Cohen's kappa. Inter-rater reliability among panelists is established before any system output is adjudicated, so panel disagreement is not mistaken for system error. Every material error is reviewed rather than sampled and confirmed by a second reader, and audited households are held out of tuning data. This is internal product verification, not human subjects research, and a determination will be obtained.</w:t>
+        <w:t xml:space="preserve"> A panel of licensed clinical social workers, independent of the engineering team and holding no equity in Olera, audits a stratified random sample of 60 cases in each of the two quarters before the month 12 gate, 120 in all, which sizes cumulative agreement to a 95 percent half-width of about 6 points. The audit then repeats annually, so accuracy is re-established as the system and the underlying program rules change. The panel determines eligibility blinded to what the platform produced and, for a subset, prepares the applications by hand. Both are compared with the platform's output, category by category for eligibility and field by field for applications, and agreement is reported as percent agreement with a 95 percent confidence interval and as Cohen's kappa. Inter-rater reliability among panelists is established before any system output is adjudicated, so panel disagreement is not mistaken for system error. Every material error is reviewed rather than sampled and confirmed by a second reader, and audited households are held out of tuning data. This is internal product verification, not human subjects research, and a determination will be obtained.</w:t>
       </w:r>
     </w:p>
     <w:p>
@@ -3450,7 +3450,7 @@
                 <w:i w:val="0"/>
                 <w:sz w:val="18"/>
               </w:rPr>
-              <w:t>Quarterly audit of 60 cases, Task 1.4</w:t>
+              <w:t>120 audited cases before the gate, Task 1.4</w:t>
             </w:r>
           </w:p>
         </w:tc>

</xml_diff>